<commit_message>
Revise Labs 4 and 5 for 75-minute sessions
</commit_message>
<xml_diff>
--- a/assets/labs/lab-04-report.docx
+++ b/assets/labs/lab-04-report.docx
@@ -9,21 +9,34 @@
       <w:r>
         <w:t>Lab 4 Report - Resonant Interference Defense</w:t>
       </w:r>
+      <w:r>
+        <w:t xml:space="preserve"/>
+      </w:r>
+      <w:r>
+        <w:t/>
+      </w:r>
+      <w:r>
+        <w:t/>
+      </w:r>
     </w:p>
     <w:p>
       <w:pPr>
         <w:pStyle w:val="Heading2"/>
       </w:pPr>
       <w:r>
-        <w:t xml:space="preserve">Name: </w:t>
+        <w:t xml:space="preserve">Name:</w:t>
       </w:r>
     </w:p>
     <w:p>
       <w:pPr>
         <w:pStyle w:val="ListBullet"/>
+        <w:numPr>
+          <w:ilvl w:val="0"/>
+          <w:numId w:val="0"/>
+        </w:numPr>
       </w:pPr>
       <w:r>
-        <w:t xml:space="preserve">Lab Partners: </w:t>
+        <w:t xml:space="preserve">Lab Partners:</w:t>
       </w:r>
     </w:p>
     <w:p>
@@ -33,139 +46,451 @@
       <w:r>
         <w:t>Table 1 - Components and Predicted Resonance (15)</w:t>
       </w:r>
+      <w:r>
+        <w:t xml:space="preserve"/>
+      </w:r>
+    </w:p>
+    <w:p>
+      <w:r>
+        <w:t>Use the measured values supplied with your kit. Do not exchange components between kits.</w:t>
+      </w:r>
     </w:p>
     <w:tbl>
       <w:tblPr>
         <w:tblStyle w:val="TableGrid"/>
-        <w:tblW w:type="auto" w:w="0"/>
-        <w:tblLook w:firstColumn="1" w:firstRow="1" w:lastColumn="0" w:lastRow="0" w:noHBand="0" w:noVBand="1" w:val="04A0"/>
+        <w:tblW w:w="11187" w:type="dxa"/>
+        <w:tblLook w:val="04A0" w:firstRow="1" w:lastRow="0" w:firstColumn="1" w:lastColumn="0" w:noHBand="0" w:noVBand="1"/>
       </w:tblPr>
       <w:tblGrid>
-        <w:gridCol w:w="1776"/>
-        <w:gridCol w:w="1776"/>
-        <w:gridCol w:w="1776"/>
-        <w:gridCol w:w="1776"/>
-        <w:gridCol w:w="1776"/>
-        <w:gridCol w:w="1776"/>
+        <w:gridCol w:w="2178"/>
+        <w:gridCol w:w="2579"/>
+        <w:gridCol w:w="2809"/>
+        <w:gridCol w:w="3621"/>
       </w:tblGrid>
       <w:tr>
+        <w:trPr>
+          <w:trHeight w:val="432"/>
+          <w:tblHeader/>
+        </w:trPr>
         <w:tc>
           <w:tcPr>
-            <w:tcW w:type="dxa" w:w="1776"/>
+            <w:tcW w:w="2178" w:type="dxa"/>
+            <w:shd w:val="clear" w:color="auto" w:fill="17324D"/>
+            <w:vAlign w:val="center"/>
           </w:tcPr>
           <w:p>
             <w:r>
-              <w:t>R</w:t>
+              <w:rPr>
+                <w:b/>
+                <w:color w:val="FFFFFF"/>
+              </w:rPr>
+              <w:t>Quantity</w:t>
             </w:r>
           </w:p>
         </w:tc>
         <w:tc>
           <w:tcPr>
-            <w:tcW w:type="dxa" w:w="1776"/>
+            <w:tcW w:w="2579" w:type="dxa"/>
+            <w:shd w:val="clear" w:color="auto" w:fill="17324D"/>
+            <w:vAlign w:val="center"/>
           </w:tcPr>
           <w:p>
             <w:r>
-              <w:t>L</w:t>
+              <w:rPr>
+                <w:b/>
+                <w:color w:val="FFFFFF"/>
+              </w:rPr>
+              <w:t>Supplied value</w:t>
             </w:r>
           </w:p>
         </w:tc>
         <w:tc>
           <w:tcPr>
-            <w:tcW w:type="dxa" w:w="1776"/>
+            <w:tcW w:w="2809" w:type="dxa"/>
+            <w:shd w:val="clear" w:color="auto" w:fill="17324D"/>
+            <w:vAlign w:val="center"/>
           </w:tcPr>
           <w:p>
             <w:r>
-              <w:t>Inductor winding R</w:t>
+              <w:rPr>
+                <w:b/>
+                <w:color w:val="FFFFFF"/>
+              </w:rPr>
+              <w:t>Unit</w:t>
             </w:r>
           </w:p>
         </w:tc>
         <w:tc>
           <w:tcPr>
-            <w:tcW w:type="dxa" w:w="1776"/>
+            <w:tcW w:w="3621" w:type="dxa"/>
+            <w:shd w:val="clear" w:color="auto" w:fill="17324D"/>
+            <w:vAlign w:val="center"/>
           </w:tcPr>
           <w:p>
             <w:r>
-              <w:t>Primary C</w:t>
+              <w:rPr>
+                <w:b/>
+                <w:color w:val="FFFFFF"/>
+              </w:rPr>
+              <w:t>Calculation / note</w:t>
+            </w:r>
+          </w:p>
+        </w:tc>
+      </w:tr>
+      <w:tr>
+        <w:trPr>
+          <w:trHeight w:val="490"/>
+        </w:trPr>
+        <w:tc>
+          <w:tcPr>
+            <w:tcW w:w="2178" w:type="dxa"/>
+            <w:vAlign w:val="center"/>
+          </w:tcPr>
+          <w:p>
+            <w:r>
+              <w:rPr>
+                <w:b w:val="0"/>
+              </w:rPr>
+              <w:t>Resistor R</w:t>
             </w:r>
           </w:p>
         </w:tc>
         <w:tc>
           <w:tcPr>
-            <w:tcW w:type="dxa" w:w="1776"/>
+            <w:tcW w:w="2579" w:type="dxa"/>
+            <w:vAlign w:val="center"/>
           </w:tcPr>
           <w:p>
             <w:r>
-              <w:t>Alternate C</w:t>
+              <w:rPr>
+                <w:b w:val="0"/>
+              </w:rPr>
             </w:r>
           </w:p>
         </w:tc>
         <w:tc>
           <w:tcPr>
-            <w:tcW w:type="dxa" w:w="1776"/>
+            <w:tcW w:w="2809" w:type="dxa"/>
+            <w:vAlign w:val="center"/>
           </w:tcPr>
           <w:p>
             <w:r>
-              <w:t>Calculated f0</w:t>
+              <w:rPr>
+                <w:b w:val="0"/>
+              </w:rPr>
+            </w:r>
+          </w:p>
+        </w:tc>
+        <w:tc>
+          <w:tcPr>
+            <w:tcW w:w="3621" w:type="dxa"/>
+          </w:tcPr>
+          <w:p>
+            <w:r>
+              <w:rPr>
+                <w:b w:val="0"/>
+              </w:rPr>
             </w:r>
           </w:p>
         </w:tc>
       </w:tr>
       <w:tr>
+        <w:trPr>
+          <w:trHeight w:val="490"/>
+        </w:trPr>
         <w:tc>
           <w:tcPr>
-            <w:tcW w:type="dxa" w:w="1776"/>
+            <w:tcW w:w="2178" w:type="dxa"/>
+            <w:vAlign w:val="center"/>
           </w:tcPr>
           <w:p>
             <w:r>
-              <w:t>Measured/assigned values</w:t>
+              <w:rPr>
+                <w:b w:val="0"/>
+              </w:rPr>
+              <w:t>Inductor L</w:t>
             </w:r>
           </w:p>
         </w:tc>
         <w:tc>
           <w:tcPr>
-            <w:tcW w:type="dxa" w:w="1776"/>
+            <w:tcW w:w="2579" w:type="dxa"/>
+            <w:vAlign w:val="center"/>
           </w:tcPr>
-          <w:p/>
+          <w:p>
+            <w:r>
+              <w:rPr>
+                <w:b w:val="0"/>
+              </w:rPr>
+            </w:r>
+          </w:p>
         </w:tc>
         <w:tc>
           <w:tcPr>
-            <w:tcW w:type="dxa" w:w="1776"/>
+            <w:tcW w:w="2809" w:type="dxa"/>
+            <w:vAlign w:val="center"/>
           </w:tcPr>
-          <w:p/>
+          <w:p>
+            <w:r>
+              <w:rPr>
+                <w:b w:val="0"/>
+              </w:rPr>
+            </w:r>
+          </w:p>
         </w:tc>
         <w:tc>
           <w:tcPr>
-            <w:tcW w:type="dxa" w:w="1776"/>
+            <w:tcW w:w="3621" w:type="dxa"/>
           </w:tcPr>
-          <w:p/>
+          <w:p>
+            <w:r>
+              <w:rPr>
+                <w:b w:val="0"/>
+              </w:rPr>
+            </w:r>
+          </w:p>
+        </w:tc>
+      </w:tr>
+      <w:tr>
+        <w:trPr>
+          <w:trHeight w:val="490"/>
+        </w:trPr>
+        <w:tc>
+          <w:tcPr>
+            <w:tcW w:w="2178" w:type="dxa"/>
+            <w:shd w:val="clear" w:color="auto" w:fill="EAF2F7"/>
+            <w:vAlign w:val="center"/>
+          </w:tcPr>
+          <w:p>
+            <w:r>
+              <w:rPr>
+                <w:b w:val="0"/>
+              </w:rPr>
+              <w:t>Inductor winding resistance</w:t>
+            </w:r>
+          </w:p>
         </w:tc>
         <w:tc>
           <w:tcPr>
-            <w:tcW w:type="dxa" w:w="1776"/>
+            <w:tcW w:w="2579" w:type="dxa"/>
+            <w:shd w:val="clear" w:color="auto" w:fill="EAF2F7"/>
+            <w:vAlign w:val="center"/>
           </w:tcPr>
-          <w:p/>
+          <w:p>
+            <w:r>
+              <w:rPr>
+                <w:b w:val="0"/>
+              </w:rPr>
+            </w:r>
+          </w:p>
         </w:tc>
         <w:tc>
           <w:tcPr>
-            <w:tcW w:type="dxa" w:w="1776"/>
+            <w:tcW w:w="2809" w:type="dxa"/>
+            <w:shd w:val="clear" w:color="auto" w:fill="EAF2F7"/>
+            <w:vAlign w:val="center"/>
           </w:tcPr>
-          <w:p/>
+          <w:p>
+            <w:r>
+              <w:rPr>
+                <w:b w:val="0"/>
+              </w:rPr>
+            </w:r>
+          </w:p>
+        </w:tc>
+        <w:tc>
+          <w:tcPr>
+            <w:tcW w:w="3621" w:type="dxa"/>
+            <w:shd w:val="clear" w:color="auto" w:fill="EAF2F7"/>
+          </w:tcPr>
+          <w:p>
+            <w:r>
+              <w:rPr>
+                <w:b w:val="0"/>
+              </w:rPr>
+            </w:r>
+          </w:p>
+        </w:tc>
+      </w:tr>
+      <w:tr>
+        <w:trPr>
+          <w:trHeight w:val="490"/>
+        </w:trPr>
+        <w:tc>
+          <w:tcPr>
+            <w:tcW w:w="2178" w:type="dxa"/>
+            <w:vAlign w:val="center"/>
+          </w:tcPr>
+          <w:p>
+            <w:r>
+              <w:rPr>
+                <w:b w:val="0"/>
+              </w:rPr>
+              <w:t>Primary capacitor C1</w:t>
+            </w:r>
+          </w:p>
+        </w:tc>
+        <w:tc>
+          <w:tcPr>
+            <w:tcW w:w="2579" w:type="dxa"/>
+            <w:vAlign w:val="center"/>
+          </w:tcPr>
+          <w:p>
+            <w:r>
+              <w:rPr>
+                <w:b w:val="0"/>
+              </w:rPr>
+            </w:r>
+          </w:p>
+        </w:tc>
+        <w:tc>
+          <w:tcPr>
+            <w:tcW w:w="2809" w:type="dxa"/>
+            <w:vAlign w:val="center"/>
+          </w:tcPr>
+          <w:p>
+            <w:r>
+              <w:rPr>
+                <w:b w:val="0"/>
+              </w:rPr>
+            </w:r>
+          </w:p>
+        </w:tc>
+        <w:tc>
+          <w:tcPr>
+            <w:tcW w:w="3621" w:type="dxa"/>
+          </w:tcPr>
+          <w:p>
+            <w:r>
+              <w:rPr>
+                <w:b w:val="0"/>
+              </w:rPr>
+            </w:r>
+          </w:p>
+        </w:tc>
+      </w:tr>
+      <w:tr>
+        <w:trPr>
+          <w:trHeight w:val="490"/>
+        </w:trPr>
+        <w:tc>
+          <w:tcPr>
+            <w:tcW w:w="2178" w:type="dxa"/>
+            <w:shd w:val="clear" w:color="auto" w:fill="EAF2F7"/>
+            <w:vAlign w:val="center"/>
+          </w:tcPr>
+          <w:p>
+            <w:r>
+              <w:rPr>
+                <w:b w:val="0"/>
+              </w:rPr>
+              <w:t>Alternate capacitor C2</w:t>
+            </w:r>
+          </w:p>
+        </w:tc>
+        <w:tc>
+          <w:tcPr>
+            <w:tcW w:w="2579" w:type="dxa"/>
+            <w:shd w:val="clear" w:color="auto" w:fill="EAF2F7"/>
+            <w:vAlign w:val="center"/>
+          </w:tcPr>
+          <w:p>
+            <w:r>
+              <w:rPr>
+                <w:b w:val="0"/>
+              </w:rPr>
+            </w:r>
+          </w:p>
+        </w:tc>
+        <w:tc>
+          <w:tcPr>
+            <w:tcW w:w="2809" w:type="dxa"/>
+            <w:shd w:val="clear" w:color="auto" w:fill="EAF2F7"/>
+            <w:vAlign w:val="center"/>
+          </w:tcPr>
+          <w:p>
+            <w:r>
+              <w:rPr>
+                <w:b w:val="0"/>
+              </w:rPr>
+            </w:r>
+          </w:p>
+        </w:tc>
+        <w:tc>
+          <w:tcPr>
+            <w:tcW w:w="3621" w:type="dxa"/>
+            <w:shd w:val="clear" w:color="auto" w:fill="EAF2F7"/>
+          </w:tcPr>
+          <w:p>
+            <w:r>
+              <w:rPr>
+                <w:b w:val="0"/>
+              </w:rPr>
+            </w:r>
+          </w:p>
+        </w:tc>
+      </w:tr>
+      <w:tr>
+        <w:trPr>
+          <w:trHeight w:val="490"/>
+        </w:trPr>
+        <w:tc>
+          <w:tcPr>
+            <w:tcW w:w="2178" w:type="dxa"/>
+            <w:vAlign w:val="center"/>
+          </w:tcPr>
+          <w:p>
+            <w:r>
+              <w:rPr>
+                <w:b w:val="0"/>
+              </w:rPr>
+              <w:t>Predicted resonance with C1</w:t>
+            </w:r>
+          </w:p>
+        </w:tc>
+        <w:tc>
+          <w:tcPr>
+            <w:tcW w:w="2579" w:type="dxa"/>
+            <w:vAlign w:val="center"/>
+          </w:tcPr>
+          <w:p>
+            <w:r>
+              <w:rPr>
+                <w:b w:val="0"/>
+              </w:rPr>
+            </w:r>
+          </w:p>
+        </w:tc>
+        <w:tc>
+          <w:tcPr>
+            <w:tcW w:w="2809" w:type="dxa"/>
+            <w:vAlign w:val="center"/>
+          </w:tcPr>
+          <w:p>
+            <w:r>
+              <w:rPr>
+                <w:b w:val="0"/>
+              </w:rPr>
+            </w:r>
+          </w:p>
+        </w:tc>
+        <w:tc>
+          <w:tcPr>
+            <w:tcW w:w="3621" w:type="dxa"/>
+          </w:tcPr>
+          <w:p>
+            <w:r>
+              <w:rPr>
+                <w:b w:val="0"/>
+              </w:rPr>
+            </w:r>
+          </w:p>
         </w:tc>
       </w:tr>
     </w:tbl>
     <w:p>
       <w:r>
-        <w:t>Show the resonant-frequency calculation and record the approved source limit.</w:t>
-      </w:r>
-    </w:p>
-    <w:p>
-      <w:r>
-        <w:t>________________________________________________________________________________</w:t>
-      </w:r>
-    </w:p>
-    <w:p>
-      <w:r>
-        <w:t>________________________________________________________________________________</w:t>
+        <w:t>Source settings: waveform __________  amplitude __________  offset __________  display mode __________</w:t>
       </w:r>
     </w:p>
     <w:p>
@@ -173,398 +498,453 @@
         <w:pStyle w:val="Heading1"/>
       </w:pPr>
       <w:r>
-        <w:t>Table 2 - Measured Frequency Response (30)</w:t>
+        <w:t>Table 2 - Fixed Frequency Response (35)</w:t>
+      </w:r>
+      <w:r>
+        <w:t xml:space="preserve"/>
       </w:r>
     </w:p>
     <w:tbl>
       <w:tblPr>
         <w:tblStyle w:val="TableGrid"/>
-        <w:tblW w:type="auto" w:w="0"/>
-        <w:tblLook w:firstColumn="1" w:firstRow="1" w:lastColumn="0" w:lastRow="0" w:noHBand="0" w:noVBand="1" w:val="04A0"/>
+        <w:tblW w:w="11187" w:type="dxa"/>
+        <w:tblLook w:val="04A0" w:firstRow="1" w:lastRow="0" w:firstColumn="1" w:lastColumn="0" w:noHBand="0" w:noVBand="1"/>
       </w:tblPr>
       <w:tblGrid>
-        <w:gridCol w:w="1776"/>
-        <w:gridCol w:w="1776"/>
-        <w:gridCol w:w="1776"/>
-        <w:gridCol w:w="1776"/>
-        <w:gridCol w:w="1776"/>
-        <w:gridCol w:w="1776"/>
+        <w:gridCol w:w="2178"/>
+        <w:gridCol w:w="2579"/>
+        <w:gridCol w:w="2809"/>
+        <w:gridCol w:w="3621"/>
       </w:tblGrid>
       <w:tr>
+        <w:trPr>
+          <w:trHeight w:val="432"/>
+          <w:tblHeader/>
+        </w:trPr>
         <w:tc>
           <w:tcPr>
-            <w:tcW w:type="dxa" w:w="1776"/>
+            <w:tcW w:w="2178" w:type="dxa"/>
+            <w:shd w:val="clear" w:color="auto" w:fill="17324D"/>
+            <w:vAlign w:val="center"/>
           </w:tcPr>
           <w:p>
             <w:r>
-              <w:t>Frequency</w:t>
+              <w:rPr>
+                <w:b/>
+                <w:color w:val="FFFFFF"/>
+              </w:rPr>
+              <w:t>Assigned frequency</w:t>
             </w:r>
           </w:p>
         </w:tc>
         <w:tc>
           <w:tcPr>
-            <w:tcW w:type="dxa" w:w="1776"/>
+            <w:tcW w:w="2579" w:type="dxa"/>
+            <w:shd w:val="clear" w:color="auto" w:fill="17324D"/>
+            <w:vAlign w:val="center"/>
           </w:tcPr>
           <w:p>
             <w:r>
-              <w:t>Vin Vpp</w:t>
+              <w:rPr>
+                <w:b/>
+                <w:color w:val="FFFFFF"/>
+              </w:rPr>
+              <w:t>Vin (Vpp)</w:t>
             </w:r>
           </w:p>
         </w:tc>
         <w:tc>
           <w:tcPr>
-            <w:tcW w:type="dxa" w:w="1776"/>
+            <w:tcW w:w="2809" w:type="dxa"/>
+            <w:shd w:val="clear" w:color="auto" w:fill="17324D"/>
+            <w:vAlign w:val="center"/>
           </w:tcPr>
           <w:p>
             <w:r>
-              <w:t>Vout Vpp</w:t>
+              <w:rPr>
+                <w:b/>
+                <w:color w:val="FFFFFF"/>
+              </w:rPr>
+              <w:t>Vout (Vpp)</w:t>
             </w:r>
           </w:p>
         </w:tc>
         <w:tc>
           <w:tcPr>
-            <w:tcW w:type="dxa" w:w="1776"/>
+            <w:tcW w:w="3621" w:type="dxa"/>
+            <w:shd w:val="clear" w:color="auto" w:fill="17324D"/>
+            <w:vAlign w:val="center"/>
           </w:tcPr>
           <w:p>
             <w:r>
+              <w:rPr>
+                <w:b/>
+                <w:color w:val="FFFFFF"/>
+              </w:rPr>
               <w:t>Vout / Vin</w:t>
-            </w:r>
-          </w:p>
-        </w:tc>
-        <w:tc>
-          <w:tcPr>
-            <w:tcW w:type="dxa" w:w="1776"/>
-          </w:tcPr>
-          <w:p>
-            <w:r>
-              <w:t>Relative to maximum</w:t>
-            </w:r>
-          </w:p>
-        </w:tc>
-        <w:tc>
-          <w:tcPr>
-            <w:tcW w:type="dxa" w:w="1776"/>
-          </w:tcPr>
-          <w:p>
-            <w:r>
-              <w:t>Observation</w:t>
             </w:r>
           </w:p>
         </w:tc>
       </w:tr>
       <w:tr>
+        <w:trPr>
+          <w:trHeight w:val="490"/>
+        </w:trPr>
         <w:tc>
           <w:tcPr>
-            <w:tcW w:type="dxa" w:w="1776"/>
+            <w:tcW w:w="2178" w:type="dxa"/>
+            <w:vAlign w:val="center"/>
           </w:tcPr>
           <w:p>
             <w:r>
+              <w:rPr>
+                <w:b w:val="0"/>
+              </w:rPr>
               <w:t>Point 1</w:t>
             </w:r>
           </w:p>
         </w:tc>
         <w:tc>
           <w:tcPr>
-            <w:tcW w:type="dxa" w:w="1776"/>
+            <w:tcW w:w="2579" w:type="dxa"/>
+            <w:vAlign w:val="center"/>
           </w:tcPr>
-          <w:p/>
+          <w:p>
+            <w:r>
+              <w:rPr>
+                <w:b w:val="0"/>
+              </w:rPr>
+            </w:r>
+          </w:p>
         </w:tc>
         <w:tc>
           <w:tcPr>
-            <w:tcW w:type="dxa" w:w="1776"/>
+            <w:tcW w:w="2809" w:type="dxa"/>
+            <w:vAlign w:val="center"/>
           </w:tcPr>
-          <w:p/>
+          <w:p>
+            <w:r>
+              <w:rPr>
+                <w:b w:val="0"/>
+              </w:rPr>
+            </w:r>
+          </w:p>
         </w:tc>
         <w:tc>
           <w:tcPr>
-            <w:tcW w:type="dxa" w:w="1776"/>
+            <w:tcW w:w="3621" w:type="dxa"/>
           </w:tcPr>
-          <w:p/>
-        </w:tc>
-        <w:tc>
-          <w:tcPr>
-            <w:tcW w:type="dxa" w:w="1776"/>
-          </w:tcPr>
-          <w:p/>
-        </w:tc>
-        <w:tc>
-          <w:tcPr>
-            <w:tcW w:type="dxa" w:w="1776"/>
-          </w:tcPr>
-          <w:p/>
+          <w:p>
+            <w:r>
+              <w:rPr>
+                <w:b w:val="0"/>
+              </w:rPr>
+            </w:r>
+          </w:p>
         </w:tc>
       </w:tr>
       <w:tr>
+        <w:trPr>
+          <w:trHeight w:val="490"/>
+        </w:trPr>
         <w:tc>
           <w:tcPr>
-            <w:tcW w:type="dxa" w:w="1776"/>
+            <w:tcW w:w="2178" w:type="dxa"/>
+            <w:vAlign w:val="center"/>
           </w:tcPr>
           <w:p>
             <w:r>
+              <w:rPr>
+                <w:b w:val="0"/>
+              </w:rPr>
               <w:t>Point 2</w:t>
             </w:r>
           </w:p>
         </w:tc>
         <w:tc>
           <w:tcPr>
-            <w:tcW w:type="dxa" w:w="1776"/>
+            <w:tcW w:w="2579" w:type="dxa"/>
+            <w:vAlign w:val="center"/>
           </w:tcPr>
-          <w:p/>
+          <w:p>
+            <w:r>
+              <w:rPr>
+                <w:b w:val="0"/>
+              </w:rPr>
+            </w:r>
+          </w:p>
         </w:tc>
         <w:tc>
           <w:tcPr>
-            <w:tcW w:type="dxa" w:w="1776"/>
+            <w:tcW w:w="2809" w:type="dxa"/>
+            <w:vAlign w:val="center"/>
           </w:tcPr>
-          <w:p/>
+          <w:p>
+            <w:r>
+              <w:rPr>
+                <w:b w:val="0"/>
+              </w:rPr>
+            </w:r>
+          </w:p>
         </w:tc>
         <w:tc>
           <w:tcPr>
-            <w:tcW w:type="dxa" w:w="1776"/>
+            <w:tcW w:w="3621" w:type="dxa"/>
           </w:tcPr>
-          <w:p/>
-        </w:tc>
-        <w:tc>
-          <w:tcPr>
-            <w:tcW w:type="dxa" w:w="1776"/>
-          </w:tcPr>
-          <w:p/>
-        </w:tc>
-        <w:tc>
-          <w:tcPr>
-            <w:tcW w:type="dxa" w:w="1776"/>
-          </w:tcPr>
-          <w:p/>
+          <w:p>
+            <w:r>
+              <w:rPr>
+                <w:b w:val="0"/>
+              </w:rPr>
+            </w:r>
+          </w:p>
         </w:tc>
       </w:tr>
       <w:tr>
+        <w:trPr>
+          <w:trHeight w:val="490"/>
+        </w:trPr>
         <w:tc>
           <w:tcPr>
-            <w:tcW w:type="dxa" w:w="1776"/>
+            <w:tcW w:w="2178" w:type="dxa"/>
+            <w:shd w:val="clear" w:color="auto" w:fill="EAF2F7"/>
+            <w:vAlign w:val="center"/>
           </w:tcPr>
           <w:p>
             <w:r>
+              <w:rPr>
+                <w:b w:val="0"/>
+              </w:rPr>
               <w:t>Point 3</w:t>
             </w:r>
           </w:p>
         </w:tc>
         <w:tc>
           <w:tcPr>
-            <w:tcW w:type="dxa" w:w="1776"/>
+            <w:tcW w:w="2579" w:type="dxa"/>
+            <w:shd w:val="clear" w:color="auto" w:fill="EAF2F7"/>
+            <w:vAlign w:val="center"/>
           </w:tcPr>
-          <w:p/>
+          <w:p>
+            <w:r>
+              <w:rPr>
+                <w:b w:val="0"/>
+              </w:rPr>
+            </w:r>
+          </w:p>
         </w:tc>
         <w:tc>
           <w:tcPr>
-            <w:tcW w:type="dxa" w:w="1776"/>
+            <w:tcW w:w="2809" w:type="dxa"/>
+            <w:shd w:val="clear" w:color="auto" w:fill="EAF2F7"/>
+            <w:vAlign w:val="center"/>
           </w:tcPr>
-          <w:p/>
+          <w:p>
+            <w:r>
+              <w:rPr>
+                <w:b w:val="0"/>
+              </w:rPr>
+            </w:r>
+          </w:p>
         </w:tc>
         <w:tc>
           <w:tcPr>
-            <w:tcW w:type="dxa" w:w="1776"/>
+            <w:tcW w:w="3621" w:type="dxa"/>
+            <w:shd w:val="clear" w:color="auto" w:fill="EAF2F7"/>
           </w:tcPr>
-          <w:p/>
-        </w:tc>
-        <w:tc>
-          <w:tcPr>
-            <w:tcW w:type="dxa" w:w="1776"/>
-          </w:tcPr>
-          <w:p/>
-        </w:tc>
-        <w:tc>
-          <w:tcPr>
-            <w:tcW w:type="dxa" w:w="1776"/>
-          </w:tcPr>
-          <w:p/>
+          <w:p>
+            <w:r>
+              <w:rPr>
+                <w:b w:val="0"/>
+              </w:rPr>
+            </w:r>
+          </w:p>
         </w:tc>
       </w:tr>
       <w:tr>
+        <w:trPr>
+          <w:trHeight w:val="490"/>
+        </w:trPr>
         <w:tc>
           <w:tcPr>
-            <w:tcW w:type="dxa" w:w="1776"/>
+            <w:tcW w:w="2178" w:type="dxa"/>
+            <w:vAlign w:val="center"/>
           </w:tcPr>
           <w:p>
             <w:r>
+              <w:rPr>
+                <w:b w:val="0"/>
+              </w:rPr>
               <w:t>Point 4</w:t>
             </w:r>
           </w:p>
         </w:tc>
         <w:tc>
           <w:tcPr>
-            <w:tcW w:type="dxa" w:w="1776"/>
+            <w:tcW w:w="2579" w:type="dxa"/>
+            <w:vAlign w:val="center"/>
           </w:tcPr>
-          <w:p/>
+          <w:p>
+            <w:r>
+              <w:rPr>
+                <w:b w:val="0"/>
+              </w:rPr>
+            </w:r>
+          </w:p>
         </w:tc>
         <w:tc>
           <w:tcPr>
-            <w:tcW w:type="dxa" w:w="1776"/>
+            <w:tcW w:w="2809" w:type="dxa"/>
+            <w:vAlign w:val="center"/>
           </w:tcPr>
-          <w:p/>
+          <w:p>
+            <w:r>
+              <w:rPr>
+                <w:b w:val="0"/>
+              </w:rPr>
+            </w:r>
+          </w:p>
         </w:tc>
         <w:tc>
           <w:tcPr>
-            <w:tcW w:type="dxa" w:w="1776"/>
+            <w:tcW w:w="3621" w:type="dxa"/>
           </w:tcPr>
-          <w:p/>
-        </w:tc>
-        <w:tc>
-          <w:tcPr>
-            <w:tcW w:type="dxa" w:w="1776"/>
-          </w:tcPr>
-          <w:p/>
-        </w:tc>
-        <w:tc>
-          <w:tcPr>
-            <w:tcW w:type="dxa" w:w="1776"/>
-          </w:tcPr>
-          <w:p/>
+          <w:p>
+            <w:r>
+              <w:rPr>
+                <w:b w:val="0"/>
+              </w:rPr>
+            </w:r>
+          </w:p>
         </w:tc>
       </w:tr>
       <w:tr>
+        <w:trPr>
+          <w:trHeight w:val="490"/>
+        </w:trPr>
         <w:tc>
           <w:tcPr>
-            <w:tcW w:type="dxa" w:w="1776"/>
+            <w:tcW w:w="2178" w:type="dxa"/>
+            <w:shd w:val="clear" w:color="auto" w:fill="EAF2F7"/>
+            <w:vAlign w:val="center"/>
           </w:tcPr>
           <w:p>
             <w:r>
+              <w:rPr>
+                <w:b w:val="0"/>
+              </w:rPr>
               <w:t>Point 5</w:t>
             </w:r>
           </w:p>
         </w:tc>
         <w:tc>
           <w:tcPr>
-            <w:tcW w:type="dxa" w:w="1776"/>
+            <w:tcW w:w="2579" w:type="dxa"/>
+            <w:shd w:val="clear" w:color="auto" w:fill="EAF2F7"/>
+            <w:vAlign w:val="center"/>
           </w:tcPr>
-          <w:p/>
+          <w:p>
+            <w:r>
+              <w:rPr>
+                <w:b w:val="0"/>
+              </w:rPr>
+            </w:r>
+          </w:p>
         </w:tc>
         <w:tc>
           <w:tcPr>
-            <w:tcW w:type="dxa" w:w="1776"/>
+            <w:tcW w:w="2809" w:type="dxa"/>
+            <w:shd w:val="clear" w:color="auto" w:fill="EAF2F7"/>
+            <w:vAlign w:val="center"/>
           </w:tcPr>
-          <w:p/>
+          <w:p>
+            <w:r>
+              <w:rPr>
+                <w:b w:val="0"/>
+              </w:rPr>
+            </w:r>
+          </w:p>
         </w:tc>
         <w:tc>
           <w:tcPr>
-            <w:tcW w:type="dxa" w:w="1776"/>
+            <w:tcW w:w="3621" w:type="dxa"/>
+            <w:shd w:val="clear" w:color="auto" w:fill="EAF2F7"/>
           </w:tcPr>
-          <w:p/>
-        </w:tc>
-        <w:tc>
-          <w:tcPr>
-            <w:tcW w:type="dxa" w:w="1776"/>
-          </w:tcPr>
-          <w:p/>
-        </w:tc>
-        <w:tc>
-          <w:tcPr>
-            <w:tcW w:type="dxa" w:w="1776"/>
-          </w:tcPr>
-          <w:p/>
+          <w:p>
+            <w:r>
+              <w:rPr>
+                <w:b w:val="0"/>
+              </w:rPr>
+            </w:r>
+          </w:p>
         </w:tc>
       </w:tr>
       <w:tr>
+        <w:trPr>
+          <w:trHeight w:val="490"/>
+        </w:trPr>
         <w:tc>
           <w:tcPr>
-            <w:tcW w:type="dxa" w:w="1776"/>
+            <w:tcW w:w="2178" w:type="dxa"/>
+            <w:vAlign w:val="center"/>
           </w:tcPr>
           <w:p>
             <w:r>
+              <w:rPr>
+                <w:b w:val="0"/>
+              </w:rPr>
               <w:t>Point 6</w:t>
             </w:r>
           </w:p>
         </w:tc>
         <w:tc>
           <w:tcPr>
-            <w:tcW w:type="dxa" w:w="1776"/>
-          </w:tcPr>
-          <w:p/>
-        </w:tc>
-        <w:tc>
-          <w:tcPr>
-            <w:tcW w:type="dxa" w:w="1776"/>
-          </w:tcPr>
-          <w:p/>
-        </w:tc>
-        <w:tc>
-          <w:tcPr>
-            <w:tcW w:type="dxa" w:w="1776"/>
-          </w:tcPr>
-          <w:p/>
-        </w:tc>
-        <w:tc>
-          <w:tcPr>
-            <w:tcW w:type="dxa" w:w="1776"/>
-          </w:tcPr>
-          <w:p/>
-        </w:tc>
-        <w:tc>
-          <w:tcPr>
-            <w:tcW w:type="dxa" w:w="1776"/>
-          </w:tcPr>
-          <w:p/>
-        </w:tc>
-      </w:tr>
-      <w:tr>
-        <w:tc>
-          <w:tcPr>
-            <w:tcW w:type="dxa" w:w="1776"/>
+            <w:tcW w:w="2579" w:type="dxa"/>
+            <w:vAlign w:val="center"/>
           </w:tcPr>
           <w:p>
             <w:r>
-              <w:t>Added point</w:t>
+              <w:rPr>
+                <w:b w:val="0"/>
+              </w:rPr>
             </w:r>
           </w:p>
         </w:tc>
         <w:tc>
           <w:tcPr>
-            <w:tcW w:type="dxa" w:w="1776"/>
+            <w:tcW w:w="2809" w:type="dxa"/>
+            <w:vAlign w:val="center"/>
           </w:tcPr>
-          <w:p/>
+          <w:p>
+            <w:r>
+              <w:rPr>
+                <w:b w:val="0"/>
+              </w:rPr>
+            </w:r>
+          </w:p>
         </w:tc>
         <w:tc>
           <w:tcPr>
-            <w:tcW w:type="dxa" w:w="1776"/>
+            <w:tcW w:w="3621" w:type="dxa"/>
           </w:tcPr>
-          <w:p/>
-        </w:tc>
-        <w:tc>
-          <w:tcPr>
-            <w:tcW w:type="dxa" w:w="1776"/>
-          </w:tcPr>
-          <w:p/>
-        </w:tc>
-        <w:tc>
-          <w:tcPr>
-            <w:tcW w:type="dxa" w:w="1776"/>
-          </w:tcPr>
-          <w:p/>
-        </w:tc>
-        <w:tc>
-          <w:tcPr>
-            <w:tcW w:type="dxa" w:w="1776"/>
-          </w:tcPr>
-          <w:p/>
+          <w:p>
+            <w:r>
+              <w:rPr>
+                <w:b w:val="0"/>
+              </w:rPr>
+            </w:r>
+          </w:p>
         </w:tc>
       </w:tr>
     </w:tbl>
     <w:p>
       <w:r>
-        <w:t>Measured f0: __________   Half-power ratio: __________   fL: __________   fH: __________   BW: __________   Q: __________</w:t>
+        <w:t>Measured f0: __________  Half-power ratio: __________  fL: __________  fH: __________  BW: __________  Q: __________</w:t>
       </w:r>
     </w:p>
     <w:p>
       <w:r>
-        <w:t>Why are the bandwidth and Q values estimates?</w:t>
-      </w:r>
-    </w:p>
-    <w:p>
-      <w:r>
-        <w:t>________________________________________________________________________________</w:t>
-      </w:r>
-    </w:p>
-    <w:p>
-      <w:r>
-        <w:t>________________________________________________________________________________</w:t>
+        <w:br w:type="page"/>
       </w:r>
     </w:p>
     <w:p>
@@ -572,314 +952,441 @@
         <w:pStyle w:val="Heading1"/>
       </w:pPr>
       <w:r>
-        <w:t>Table 3 - Selectivity and Retuning (25)</w:t>
+        <w:t>Table 3 - Selectivity and Retuning (20)</w:t>
+      </w:r>
+      <w:r>
+        <w:t xml:space="preserve"/>
       </w:r>
     </w:p>
     <w:tbl>
       <w:tblPr>
         <w:tblStyle w:val="TableGrid"/>
-        <w:tblW w:type="auto" w:w="0"/>
-        <w:tblLook w:firstColumn="1" w:firstRow="1" w:lastColumn="0" w:lastRow="0" w:noHBand="0" w:noVBand="1" w:val="04A0"/>
+        <w:tblW w:w="11187" w:type="dxa"/>
+        <w:tblLook w:val="04A0" w:firstRow="1" w:lastRow="0" w:firstColumn="1" w:lastColumn="0" w:noHBand="0" w:noVBand="1"/>
       </w:tblPr>
       <w:tblGrid>
-        <w:gridCol w:w="1776"/>
-        <w:gridCol w:w="1776"/>
-        <w:gridCol w:w="1776"/>
-        <w:gridCol w:w="1776"/>
-        <w:gridCol w:w="1776"/>
-        <w:gridCol w:w="1776"/>
+        <w:gridCol w:w="2178"/>
+        <w:gridCol w:w="2579"/>
+        <w:gridCol w:w="2809"/>
+        <w:gridCol w:w="3621"/>
       </w:tblGrid>
       <w:tr>
+        <w:trPr>
+          <w:trHeight w:val="432"/>
+          <w:tblHeader/>
+        </w:trPr>
         <w:tc>
           <w:tcPr>
-            <w:tcW w:type="dxa" w:w="1776"/>
+            <w:tcW w:w="2178" w:type="dxa"/>
+            <w:shd w:val="clear" w:color="auto" w:fill="17324D"/>
+            <w:vAlign w:val="center"/>
           </w:tcPr>
           <w:p>
             <w:r>
+              <w:rPr>
+                <w:b/>
+                <w:color w:val="FFFFFF"/>
+              </w:rPr>
               <w:t>Condition</w:t>
             </w:r>
           </w:p>
         </w:tc>
         <w:tc>
           <w:tcPr>
-            <w:tcW w:type="dxa" w:w="1776"/>
+            <w:tcW w:w="2579" w:type="dxa"/>
+            <w:shd w:val="clear" w:color="auto" w:fill="17324D"/>
+            <w:vAlign w:val="center"/>
           </w:tcPr>
           <w:p>
             <w:r>
+              <w:rPr>
+                <w:b/>
+                <w:color w:val="FFFFFF"/>
+              </w:rPr>
               <w:t>Frequency</w:t>
             </w:r>
           </w:p>
         </w:tc>
         <w:tc>
           <w:tcPr>
-            <w:tcW w:type="dxa" w:w="1776"/>
+            <w:tcW w:w="2809" w:type="dxa"/>
+            <w:shd w:val="clear" w:color="auto" w:fill="17324D"/>
+            <w:vAlign w:val="center"/>
           </w:tcPr>
           <w:p>
             <w:r>
-              <w:t>Vin Vpp</w:t>
+              <w:rPr>
+                <w:b/>
+                <w:color w:val="FFFFFF"/>
+              </w:rPr>
+              <w:t>Vin (Vpp)</w:t>
             </w:r>
           </w:p>
         </w:tc>
         <w:tc>
           <w:tcPr>
-            <w:tcW w:type="dxa" w:w="1776"/>
+            <w:tcW w:w="3621" w:type="dxa"/>
+            <w:shd w:val="clear" w:color="auto" w:fill="17324D"/>
+            <w:vAlign w:val="center"/>
           </w:tcPr>
           <w:p>
             <w:r>
-              <w:t>Vout Vpp</w:t>
-            </w:r>
-          </w:p>
-        </w:tc>
-        <w:tc>
-          <w:tcPr>
-            <w:tcW w:type="dxa" w:w="1776"/>
-          </w:tcPr>
-          <w:p>
-            <w:r>
+              <w:rPr>
+                <w:b/>
+                <w:color w:val="FFFFFF"/>
+              </w:rPr>
               <w:t>Vout / Vin</w:t>
-            </w:r>
-          </w:p>
-        </w:tc>
-        <w:tc>
-          <w:tcPr>
-            <w:tcW w:type="dxa" w:w="1776"/>
-          </w:tcPr>
-          <w:p>
-            <w:r>
-              <w:t>Comparison result</w:t>
             </w:r>
           </w:p>
         </w:tc>
       </w:tr>
       <w:tr>
+        <w:trPr>
+          <w:trHeight w:val="490"/>
+        </w:trPr>
         <w:tc>
           <w:tcPr>
-            <w:tcW w:type="dxa" w:w="1776"/>
+            <w:tcW w:w="2178" w:type="dxa"/>
+            <w:vAlign w:val="center"/>
           </w:tcPr>
           <w:p>
             <w:r>
+              <w:rPr>
+                <w:b w:val="0"/>
+              </w:rPr>
               <w:t>Desired tone</w:t>
             </w:r>
           </w:p>
         </w:tc>
         <w:tc>
           <w:tcPr>
-            <w:tcW w:type="dxa" w:w="1776"/>
-          </w:tcPr>
-          <w:p/>
-        </w:tc>
-        <w:tc>
-          <w:tcPr>
-            <w:tcW w:type="dxa" w:w="1776"/>
-          </w:tcPr>
-          <w:p/>
-        </w:tc>
-        <w:tc>
-          <w:tcPr>
-            <w:tcW w:type="dxa" w:w="1776"/>
-          </w:tcPr>
-          <w:p/>
-        </w:tc>
-        <w:tc>
-          <w:tcPr>
-            <w:tcW w:type="dxa" w:w="1776"/>
-          </w:tcPr>
-          <w:p/>
-        </w:tc>
-        <w:tc>
-          <w:tcPr>
-            <w:tcW w:type="dxa" w:w="1776"/>
-          </w:tcPr>
-          <w:p/>
-        </w:tc>
-      </w:tr>
-      <w:tr>
-        <w:tc>
-          <w:tcPr>
-            <w:tcW w:type="dxa" w:w="1776"/>
+            <w:tcW w:w="2579" w:type="dxa"/>
+            <w:vAlign w:val="center"/>
           </w:tcPr>
           <w:p>
             <w:r>
-              <w:t>Off-channel interferer</w:t>
+              <w:rPr>
+                <w:b w:val="0"/>
+              </w:rPr>
             </w:r>
           </w:p>
         </w:tc>
         <w:tc>
           <w:tcPr>
-            <w:tcW w:type="dxa" w:w="1776"/>
-          </w:tcPr>
-          <w:p/>
-        </w:tc>
-        <w:tc>
-          <w:tcPr>
-            <w:tcW w:type="dxa" w:w="1776"/>
-          </w:tcPr>
-          <w:p/>
-        </w:tc>
-        <w:tc>
-          <w:tcPr>
-            <w:tcW w:type="dxa" w:w="1776"/>
-          </w:tcPr>
-          <w:p/>
-        </w:tc>
-        <w:tc>
-          <w:tcPr>
-            <w:tcW w:type="dxa" w:w="1776"/>
-          </w:tcPr>
-          <w:p/>
-        </w:tc>
-        <w:tc>
-          <w:tcPr>
-            <w:tcW w:type="dxa" w:w="1776"/>
-          </w:tcPr>
-          <w:p/>
-        </w:tc>
-      </w:tr>
-      <w:tr>
-        <w:tc>
-          <w:tcPr>
-            <w:tcW w:type="dxa" w:w="1776"/>
+            <w:tcW w:w="2809" w:type="dxa"/>
+            <w:vAlign w:val="center"/>
           </w:tcPr>
           <w:p>
             <w:r>
-              <w:t>Original C at original f0</w:t>
+              <w:rPr>
+                <w:b w:val="0"/>
+              </w:rPr>
             </w:r>
           </w:p>
         </w:tc>
         <w:tc>
           <w:tcPr>
-            <w:tcW w:type="dxa" w:w="1776"/>
+            <w:tcW w:w="3621" w:type="dxa"/>
           </w:tcPr>
-          <w:p/>
-        </w:tc>
-        <w:tc>
-          <w:tcPr>
-            <w:tcW w:type="dxa" w:w="1776"/>
-          </w:tcPr>
-          <w:p/>
-        </w:tc>
-        <w:tc>
-          <w:tcPr>
-            <w:tcW w:type="dxa" w:w="1776"/>
-          </w:tcPr>
-          <w:p/>
-        </w:tc>
-        <w:tc>
-          <w:tcPr>
-            <w:tcW w:type="dxa" w:w="1776"/>
-          </w:tcPr>
-          <w:p/>
-        </w:tc>
-        <w:tc>
-          <w:tcPr>
-            <w:tcW w:type="dxa" w:w="1776"/>
-          </w:tcPr>
-          <w:p/>
+          <w:p>
+            <w:r>
+              <w:rPr>
+                <w:b w:val="0"/>
+              </w:rPr>
+            </w:r>
+          </w:p>
         </w:tc>
       </w:tr>
       <w:tr>
+        <w:trPr>
+          <w:trHeight w:val="490"/>
+        </w:trPr>
         <w:tc>
           <w:tcPr>
-            <w:tcW w:type="dxa" w:w="1776"/>
+            <w:tcW w:w="2178" w:type="dxa"/>
+            <w:vAlign w:val="center"/>
           </w:tcPr>
           <w:p>
             <w:r>
-              <w:t>Alternate C at original f0</w:t>
+              <w:rPr>
+                <w:b w:val="0"/>
+              </w:rPr>
+              <w:t>Off-channel tone</w:t>
             </w:r>
           </w:p>
         </w:tc>
         <w:tc>
           <w:tcPr>
-            <w:tcW w:type="dxa" w:w="1776"/>
-          </w:tcPr>
-          <w:p/>
-        </w:tc>
-        <w:tc>
-          <w:tcPr>
-            <w:tcW w:type="dxa" w:w="1776"/>
-          </w:tcPr>
-          <w:p/>
-        </w:tc>
-        <w:tc>
-          <w:tcPr>
-            <w:tcW w:type="dxa" w:w="1776"/>
-          </w:tcPr>
-          <w:p/>
-        </w:tc>
-        <w:tc>
-          <w:tcPr>
-            <w:tcW w:type="dxa" w:w="1776"/>
-          </w:tcPr>
-          <w:p/>
-        </w:tc>
-        <w:tc>
-          <w:tcPr>
-            <w:tcW w:type="dxa" w:w="1776"/>
-          </w:tcPr>
-          <w:p/>
-        </w:tc>
-      </w:tr>
-      <w:tr>
-        <w:tc>
-          <w:tcPr>
-            <w:tcW w:type="dxa" w:w="1776"/>
+            <w:tcW w:w="2579" w:type="dxa"/>
+            <w:vAlign w:val="center"/>
           </w:tcPr>
           <w:p>
             <w:r>
-              <w:t>Alternate C near new f0</w:t>
+              <w:rPr>
+                <w:b w:val="0"/>
+              </w:rPr>
             </w:r>
           </w:p>
         </w:tc>
         <w:tc>
           <w:tcPr>
-            <w:tcW w:type="dxa" w:w="1776"/>
+            <w:tcW w:w="2809" w:type="dxa"/>
+            <w:vAlign w:val="center"/>
           </w:tcPr>
-          <w:p/>
+          <w:p>
+            <w:r>
+              <w:rPr>
+                <w:b w:val="0"/>
+              </w:rPr>
+            </w:r>
+          </w:p>
         </w:tc>
         <w:tc>
           <w:tcPr>
-            <w:tcW w:type="dxa" w:w="1776"/>
+            <w:tcW w:w="3621" w:type="dxa"/>
           </w:tcPr>
-          <w:p/>
+          <w:p>
+            <w:r>
+              <w:rPr>
+                <w:b w:val="0"/>
+              </w:rPr>
+            </w:r>
+          </w:p>
+        </w:tc>
+      </w:tr>
+      <w:tr>
+        <w:trPr>
+          <w:trHeight w:val="490"/>
+        </w:trPr>
+        <w:tc>
+          <w:tcPr>
+            <w:tcW w:w="2178" w:type="dxa"/>
+            <w:shd w:val="clear" w:color="auto" w:fill="EAF2F7"/>
+            <w:vAlign w:val="center"/>
+          </w:tcPr>
+          <w:p>
+            <w:r>
+              <w:rPr>
+                <w:b w:val="0"/>
+              </w:rPr>
+              <w:t>C1 at original f0</w:t>
+            </w:r>
+          </w:p>
         </w:tc>
         <w:tc>
           <w:tcPr>
-            <w:tcW w:type="dxa" w:w="1776"/>
+            <w:tcW w:w="2579" w:type="dxa"/>
+            <w:shd w:val="clear" w:color="auto" w:fill="EAF2F7"/>
+            <w:vAlign w:val="center"/>
           </w:tcPr>
-          <w:p/>
+          <w:p>
+            <w:r>
+              <w:rPr>
+                <w:b w:val="0"/>
+              </w:rPr>
+            </w:r>
+          </w:p>
         </w:tc>
         <w:tc>
           <w:tcPr>
-            <w:tcW w:type="dxa" w:w="1776"/>
+            <w:tcW w:w="2809" w:type="dxa"/>
+            <w:shd w:val="clear" w:color="auto" w:fill="EAF2F7"/>
+            <w:vAlign w:val="center"/>
           </w:tcPr>
-          <w:p/>
+          <w:p>
+            <w:r>
+              <w:rPr>
+                <w:b w:val="0"/>
+              </w:rPr>
+            </w:r>
+          </w:p>
         </w:tc>
         <w:tc>
           <w:tcPr>
-            <w:tcW w:type="dxa" w:w="1776"/>
+            <w:tcW w:w="3621" w:type="dxa"/>
+            <w:shd w:val="clear" w:color="auto" w:fill="EAF2F7"/>
           </w:tcPr>
-          <w:p/>
+          <w:p>
+            <w:r>
+              <w:rPr>
+                <w:b w:val="0"/>
+              </w:rPr>
+            </w:r>
+          </w:p>
+        </w:tc>
+      </w:tr>
+      <w:tr>
+        <w:trPr>
+          <w:trHeight w:val="490"/>
+        </w:trPr>
+        <w:tc>
+          <w:tcPr>
+            <w:tcW w:w="2178" w:type="dxa"/>
+            <w:vAlign w:val="center"/>
+          </w:tcPr>
+          <w:p>
+            <w:r>
+              <w:rPr>
+                <w:b w:val="0"/>
+              </w:rPr>
+              <w:t>C2 at original f0</w:t>
+            </w:r>
+          </w:p>
+        </w:tc>
+        <w:tc>
+          <w:tcPr>
+            <w:tcW w:w="2579" w:type="dxa"/>
+            <w:vAlign w:val="center"/>
+          </w:tcPr>
+          <w:p>
+            <w:r>
+              <w:rPr>
+                <w:b w:val="0"/>
+              </w:rPr>
+            </w:r>
+          </w:p>
+        </w:tc>
+        <w:tc>
+          <w:tcPr>
+            <w:tcW w:w="2809" w:type="dxa"/>
+            <w:vAlign w:val="center"/>
+          </w:tcPr>
+          <w:p>
+            <w:r>
+              <w:rPr>
+                <w:b w:val="0"/>
+              </w:rPr>
+            </w:r>
+          </w:p>
+        </w:tc>
+        <w:tc>
+          <w:tcPr>
+            <w:tcW w:w="3621" w:type="dxa"/>
+          </w:tcPr>
+          <w:p>
+            <w:r>
+              <w:rPr>
+                <w:b w:val="0"/>
+              </w:rPr>
+            </w:r>
+          </w:p>
+        </w:tc>
+      </w:tr>
+      <w:tr>
+        <w:trPr>
+          <w:trHeight w:val="490"/>
+        </w:trPr>
+        <w:tc>
+          <w:tcPr>
+            <w:tcW w:w="2178" w:type="dxa"/>
+            <w:shd w:val="clear" w:color="auto" w:fill="EAF2F7"/>
+            <w:vAlign w:val="center"/>
+          </w:tcPr>
+          <w:p>
+            <w:r>
+              <w:rPr>
+                <w:b w:val="0"/>
+              </w:rPr>
+              <w:t>C2 near predicted new f0</w:t>
+            </w:r>
+          </w:p>
+        </w:tc>
+        <w:tc>
+          <w:tcPr>
+            <w:tcW w:w="2579" w:type="dxa"/>
+            <w:shd w:val="clear" w:color="auto" w:fill="EAF2F7"/>
+            <w:vAlign w:val="center"/>
+          </w:tcPr>
+          <w:p>
+            <w:r>
+              <w:rPr>
+                <w:b w:val="0"/>
+              </w:rPr>
+            </w:r>
+          </w:p>
+        </w:tc>
+        <w:tc>
+          <w:tcPr>
+            <w:tcW w:w="2809" w:type="dxa"/>
+            <w:shd w:val="clear" w:color="auto" w:fill="EAF2F7"/>
+            <w:vAlign w:val="center"/>
+          </w:tcPr>
+          <w:p>
+            <w:r>
+              <w:rPr>
+                <w:b w:val="0"/>
+              </w:rPr>
+            </w:r>
+          </w:p>
+        </w:tc>
+        <w:tc>
+          <w:tcPr>
+            <w:tcW w:w="3621" w:type="dxa"/>
+            <w:shd w:val="clear" w:color="auto" w:fill="EAF2F7"/>
+          </w:tcPr>
+          <w:p>
+            <w:r>
+              <w:rPr>
+                <w:b w:val="0"/>
+              </w:rPr>
+            </w:r>
+          </w:p>
         </w:tc>
       </w:tr>
     </w:tbl>
     <w:p>
       <w:r>
-        <w:t>Interferer/desired output ratio: __________   Predicted new f0: __________</w:t>
+        <w:t>Interferer/desired output ratio: __________   Predicted new f0 with C2: __________</w:t>
+      </w:r>
+    </w:p>
+    <w:p>
+      <w:pPr>
+        <w:spacing w:after="200"/>
+        <w:rPr>
+          <w:i/>
+          <w:iCs/>
+        </w:rPr>
+      </w:pPr>
+      <w:r>
+        <w:rPr>
+          <w:i/>
+          <w:iCs/>
+        </w:rPr>
+        <w:t>Why are the measured bandwidth and Q estimates rather than exact values?</w:t>
       </w:r>
     </w:p>
     <w:p>
       <w:r>
-        <w:t>Did retuning shift the favored frequency in the predicted direction? Cite measurements.</w:t>
+        <w:br/>
+        <w:br/>
+      </w:r>
+    </w:p>
+    <w:p>
+      <w:pPr>
+        <w:spacing w:after="200"/>
+        <w:rPr>
+          <w:i/>
+          <w:iCs/>
+        </w:rPr>
+      </w:pPr>
+      <w:r>
+        <w:rPr>
+          <w:i/>
+          <w:iCs/>
+        </w:rPr>
+        <w:t>Did the capacitor change shift the favored frequency in the predicted direction? Cite the measurements.</w:t>
       </w:r>
     </w:p>
     <w:p>
       <w:r>
-        <w:t>________________________________________________________________________________</w:t>
+        <w:br/>
+        <w:br/>
+        <w:br/>
       </w:r>
     </w:p>
     <w:p>
       <w:r>
-        <w:t>________________________________________________________________________________</w:t>
+        <w:br w:type="page"/>
       </w:r>
     </w:p>
     <w:p>
@@ -888,6 +1395,14 @@
       </w:pPr>
       <w:r>
         <w:t>Evidence (15)</w:t>
+      </w:r>
+      <w:r>
+        <w:t xml:space="preserve"/>
+      </w:r>
+    </w:p>
+    <w:p>
+      <w:r>
+        <w:t>Insert a readable photo or screenshot for each scenario:</w:t>
       </w:r>
     </w:p>
     <w:p>
@@ -900,11 +1415,14 @@
     </w:p>
     <w:p>
       <w:r>
-        <w:t>Pictured: Circuit, component placement, source, and both probe locations.</w:t>
+        <w:t>Pictured: Circuit, component placement, source connection, and both probe locations.</w:t>
       </w:r>
     </w:p>
     <w:p>
       <w:r>
+        <w:br/>
+        <w:br/>
+        <w:br/>
         <w:br/>
         <w:br/>
         <w:br/>
@@ -916,12 +1434,12 @@
         <w:pStyle w:val="Heading2"/>
       </w:pPr>
       <w:r>
-        <w:t>Peak Response</w:t>
+        <w:t>Desired and Off-Channel Comparison</w:t>
       </w:r>
     </w:p>
     <w:p>
       <w:r>
-        <w:t>Pictured: Both waveforms with frequency, Vin, Vout, and scales visible.</w:t>
+        <w:t>Pictured: Labeled equal-input desired and off-channel conditions with frequency, Vin, Vout, and scales readable.</w:t>
       </w:r>
     </w:p>
     <w:p>
@@ -930,27 +1448,14 @@
         <w:br/>
         <w:br/>
         <w:br/>
-      </w:r>
-    </w:p>
-    <w:p>
-      <w:pPr>
-        <w:pStyle w:val="Heading2"/>
-      </w:pPr>
-      <w:r>
-        <w:t>Desired and Interfering Tones</w:t>
+        <w:br/>
+        <w:br/>
+        <w:br/>
       </w:r>
     </w:p>
     <w:p>
       <w:r>
-        <w:t>Pictured: Labeled equal-input conditions with output readings visible.</w:t>
-      </w:r>
-    </w:p>
-    <w:p>
-      <w:r>
-        <w:br/>
-        <w:br/>
-        <w:br/>
-        <w:br/>
+        <w:br w:type="page"/>
       </w:r>
     </w:p>
     <w:p>
@@ -960,52 +1465,166 @@
       <w:r>
         <w:t>Conclusion (15)</w:t>
       </w:r>
+      <w:r>
+        <w:t xml:space="preserve"/>
+      </w:r>
     </w:p>
     <w:p>
+      <w:pPr>
+        <w:rPr>
+          <w:i/>
+          <w:iCs/>
+        </w:rPr>
+      </w:pPr>
       <w:r>
-        <w:t>Summarize the lab, then address each prompt:</w:t>
+        <w:rPr>
+          <w:i/>
+          <w:iCs/>
+        </w:rPr>
+        <w:t xml:space="preserve">Give a summary of what you did and learned. In addition, answer these questions:</w:t>
+      </w:r>
+      <w:r>
+        <w:rPr>
+          <w:i/>
+          <w:iCs/>
+        </w:rPr>
+        <w:t/>
+      </w:r>
+      <w:r>
+        <w:rPr>
+          <w:i/>
+          <w:iCs/>
+        </w:rPr>
+        <w:t xml:space="preserve"/>
+      </w:r>
+      <w:r>
+        <w:rPr>
+          <w:i/>
+          <w:iCs/>
+        </w:rPr>
+        <w:t xml:space="preserve"/>
+      </w:r>
+      <w:r>
+        <w:rPr>
+          <w:i/>
+          <w:iCs/>
+        </w:rPr>
+        <w:t/>
+      </w:r>
+      <w:r>
+        <w:rPr>
+          <w:i/>
+          <w:iCs/>
+        </w:rPr>
+        <w:t xml:space="preserve"/>
       </w:r>
     </w:p>
     <w:p>
       <w:pPr>
         <w:pStyle w:val="ListParagraph"/>
+        <w:numPr>
+          <w:ilvl w:val="0"/>
+          <w:numId w:val="10"/>
+        </w:numPr>
+        <w:rPr>
+          <w:i/>
+          <w:iCs/>
+        </w:rPr>
       </w:pPr>
       <w:r>
-        <w:t>What was the measured pass frequency and how close was it to prediction?</w:t>
+        <w:rPr>
+          <w:i/>
+          <w:iCs/>
+        </w:rPr>
+        <w:t xml:space="preserve">What was the measured pass frequency, and how closely did it agree with the prediction?</w:t>
+      </w:r>
+      <w:r>
+        <w:rPr>
+          <w:i/>
+          <w:iCs/>
+        </w:rPr>
+        <w:t/>
       </w:r>
     </w:p>
     <w:p>
       <w:pPr>
         <w:pStyle w:val="ListParagraph"/>
+        <w:numPr>
+          <w:ilvl w:val="0"/>
+          <w:numId w:val="10"/>
+        </w:numPr>
+        <w:rPr>
+          <w:i/>
+          <w:iCs/>
+        </w:rPr>
       </w:pPr>
       <w:r>
-        <w:t>How strongly did the channel reduce the tested off-channel tone relative to the desired tone?</w:t>
+        <w:rPr>
+          <w:i/>
+          <w:iCs/>
+        </w:rPr>
+        <w:t xml:space="preserve">How strongly did the channel reduce the tested off-channel tone relative to the desired tone?</w:t>
+      </w:r>
+      <w:r>
+        <w:rPr>
+          <w:i/>
+          <w:iCs/>
+        </w:rPr>
+        <w:t/>
       </w:r>
     </w:p>
     <w:p>
       <w:pPr>
         <w:pStyle w:val="ListParagraph"/>
+        <w:numPr>
+          <w:ilvl w:val="0"/>
+          <w:numId w:val="10"/>
+        </w:numPr>
+        <w:rPr>
+          <w:i/>
+          <w:iCs/>
+        </w:rPr>
       </w:pPr>
       <w:r>
-        <w:t>How did the capacitor change affect the favored frequency, and why?</w:t>
+        <w:rPr>
+          <w:i/>
+          <w:iCs/>
+        </w:rPr>
+        <w:t xml:space="preserve">How did the capacitor change affect the favored frequency, and why?</w:t>
+      </w:r>
+      <w:r>
+        <w:rPr>
+          <w:i/>
+          <w:iCs/>
+        </w:rPr>
+        <w:t/>
       </w:r>
     </w:p>
     <w:p>
       <w:pPr>
         <w:pStyle w:val="ListParagraph"/>
+        <w:numPr>
+          <w:ilvl w:val="0"/>
+          <w:numId w:val="10"/>
+        </w:numPr>
+        <w:rPr>
+          <w:i/>
+          <w:iCs/>
+        </w:rPr>
       </w:pPr>
       <w:r>
-        <w:t>What does this test support, and what broader interference claim does it not prove?</w:t>
+        <w:rPr>
+          <w:i/>
+          <w:iCs/>
+        </w:rPr>
+        <w:t xml:space="preserve">What does this test support, and what broader interference claim does it not prove?</w:t>
       </w:r>
-    </w:p>
-    <w:p>
       <w:r>
-        <w:t>________________________________________________________________________________</w:t>
-      </w:r>
-    </w:p>
-    <w:p>
-      <w:r>
-        <w:t>________________________________________________________________________________</w:t>
+        <w:rPr>
+          <w:i/>
+          <w:iCs/>
+        </w:rPr>
+        <w:t/>
       </w:r>
     </w:p>
     <w:sectPr>
@@ -1796,7 +2415,7 @@
   <w:style w:type="paragraph" w:default="1" w:styleId="Normal">
     <w:name w:val="Normal"/>
     <w:qFormat/>
-    <w:rsid w:val="0025644F"/>
+    <w:rsid w:val="009D2B7E"/>
     <w:pPr>
       <w:spacing w:after="80"/>
     </w:pPr>

</xml_diff>